<commit_message>
Update user stories template
</commit_message>
<xml_diff>
--- a/lab/proyecto/src/funcionales/plantillaHistoriasDeUsuario.docx
+++ b/lab/proyecto/src/funcionales/plantillaHistoriasDeUsuario.docx
@@ -1,6 +1,6 @@
 
 <file path=word/document.xml><?xml version="1.0" encoding="utf-8"?>
-<w:document xmlns:o="urn:schemas-microsoft-com:office:office" xmlns:r="http://schemas.openxmlformats.org/officeDocument/2006/relationships" xmlns:v="urn:schemas-microsoft-com:vml" xmlns:w="http://schemas.openxmlformats.org/wordprocessingml/2006/main" xmlns:w10="urn:schemas-microsoft-com:office:word" xmlns:wp="http://schemas.openxmlformats.org/drawingml/2006/wordprocessingDrawing" xmlns:pic="http://schemas.openxmlformats.org/drawingml/2006/picture" xmlns:wps="http://schemas.microsoft.com/office/word/2010/wordprocessingShape" xmlns:wpg="http://schemas.microsoft.com/office/word/2010/wordprocessingGroup" xmlns:mc="http://schemas.openxmlformats.org/markup-compatibility/2006" xmlns:wp14="http://schemas.microsoft.com/office/word/2010/wordprocessingDrawing" xmlns:w14="http://schemas.microsoft.com/office/word/2010/wordml" xmlns:w15="http://schemas.microsoft.com/office/word/2012/wordml" mc:Ignorable="w14 wp14 w15">
+<w:document xmlns:o="urn:schemas-microsoft-com:office:office" xmlns:r="http://schemas.openxmlformats.org/officeDocument/2006/relationships" xmlns:v="urn:schemas-microsoft-com:vml" xmlns:w="http://schemas.openxmlformats.org/wordprocessingml/2006/main" xmlns:w10="urn:schemas-microsoft-com:office:word" xmlns:wp="http://schemas.openxmlformats.org/drawingml/2006/wordprocessingDrawing" xmlns:wps="http://schemas.microsoft.com/office/word/2010/wordprocessingShape" xmlns:wpg="http://schemas.microsoft.com/office/word/2010/wordprocessingGroup" xmlns:mc="http://schemas.openxmlformats.org/markup-compatibility/2006" xmlns:wp14="http://schemas.microsoft.com/office/word/2010/wordprocessingDrawing" xmlns:w14="http://schemas.microsoft.com/office/word/2010/wordml" xmlns:w15="http://schemas.microsoft.com/office/word/2012/wordml" mc:Ignorable="w14 wp14 w15">
   <w:body>
     <w:p>
       <w:pPr>
@@ -23,7 +23,7 @@
         <w:pStyle w:val="Heading2"/>
         <w:numPr>
           <w:ilvl w:val="0"/>
-          <w:numId w:val="1"/>
+          <w:numId w:val="2"/>
         </w:numPr>
         <w:spacing w:before="200" w:after="240"/>
         <w:rPr>
@@ -84,7 +84,7 @@
         <w:pStyle w:val="Heading2"/>
         <w:numPr>
           <w:ilvl w:val="0"/>
-          <w:numId w:val="1"/>
+          <w:numId w:val="2"/>
         </w:numPr>
         <w:spacing w:before="0" w:after="240"/>
         <w:rPr>
@@ -102,20 +102,20 @@
       <w:tblPr>
         <w:tblStyle w:val="Tablaconcuadrcula"/>
         <w:tblW w:w="8494" w:type="dxa"/>
-        <w:jc w:val="start"/>
+        <w:jc w:val="left"/>
         <w:tblInd w:w="0" w:type="dxa"/>
         <w:tblLayout w:type="fixed"/>
         <w:tblCellMar>
           <w:top w:w="0" w:type="dxa"/>
-          <w:start w:w="108" w:type="dxa"/>
+          <w:left w:w="108" w:type="dxa"/>
           <w:bottom w:w="0" w:type="dxa"/>
-          <w:end w:w="108" w:type="dxa"/>
+          <w:right w:w="108" w:type="dxa"/>
         </w:tblCellMar>
         <w:tblLook w:val="04a0" w:noHBand="0" w:noVBand="1" w:firstColumn="1" w:lastRow="0" w:lastColumn="0" w:firstRow="1"/>
       </w:tblPr>
       <w:tblGrid>
         <w:gridCol w:w="1652"/>
-        <w:gridCol w:w="6842"/>
+        <w:gridCol w:w="6841"/>
       </w:tblGrid>
       <w:tr>
         <w:trPr/>
@@ -128,12 +128,14 @@
           <w:p>
             <w:pPr>
               <w:pStyle w:val="Normal"/>
-              <w:widowControl/>
+              <w:widowControl w:val="false"/>
+              <w:suppressAutoHyphens w:val="true"/>
               <w:spacing w:lineRule="auto" w:line="240" w:before="0" w:after="0"/>
-              <w:jc w:val="start"/>
+              <w:jc w:val="left"/>
               <w:rPr>
                 <w:b/>
-                <w:color w:themeColor="background1" w:val="FFFFFF"/>
+                <w:b/>
+                <w:color w:val="FFFFFF" w:themeColor="background1"/>
                 <w:sz w:val="20"/>
                 <w:szCs w:val="20"/>
                 <w:lang w:val="es-ES_tradnl"/>
@@ -142,7 +144,7 @@
             <w:r>
               <w:rPr>
                 <w:b/>
-                <w:color w:themeColor="background1" w:val="FFFFFF"/>
+                <w:color w:val="FFFFFF" w:themeColor="background1"/>
                 <w:kern w:val="0"/>
                 <w:sz w:val="20"/>
                 <w:szCs w:val="20"/>
@@ -154,15 +156,16 @@
         </w:tc>
         <w:tc>
           <w:tcPr>
-            <w:tcW w:w="6842" w:type="dxa"/>
+            <w:tcW w:w="6841" w:type="dxa"/>
             <w:tcBorders/>
           </w:tcPr>
           <w:p>
             <w:pPr>
               <w:pStyle w:val="Normal"/>
-              <w:widowControl/>
+              <w:widowControl w:val="false"/>
+              <w:suppressAutoHyphens w:val="true"/>
               <w:spacing w:lineRule="auto" w:line="240" w:before="0" w:after="0"/>
-              <w:jc w:val="start"/>
+              <w:jc w:val="left"/>
               <w:rPr>
                 <w:sz w:val="20"/>
                 <w:szCs w:val="20"/>
@@ -182,9 +185,10 @@
           <w:p>
             <w:pPr>
               <w:pStyle w:val="Normal"/>
-              <w:widowControl/>
+              <w:widowControl w:val="false"/>
+              <w:suppressAutoHyphens w:val="true"/>
               <w:spacing w:lineRule="auto" w:line="240" w:before="0" w:after="0"/>
-              <w:jc w:val="start"/>
+              <w:jc w:val="left"/>
               <w:rPr>
                 <w:sz w:val="20"/>
                 <w:szCs w:val="20"/>
@@ -214,12 +218,14 @@
           <w:p>
             <w:pPr>
               <w:pStyle w:val="Normal"/>
-              <w:widowControl/>
+              <w:widowControl w:val="false"/>
+              <w:suppressAutoHyphens w:val="true"/>
               <w:spacing w:lineRule="auto" w:line="240" w:before="0" w:after="0"/>
-              <w:jc w:val="start"/>
+              <w:jc w:val="left"/>
               <w:rPr>
                 <w:b/>
-                <w:color w:themeColor="background1" w:val="FFFFFF"/>
+                <w:b/>
+                <w:color w:val="FFFFFF" w:themeColor="background1"/>
                 <w:sz w:val="20"/>
                 <w:szCs w:val="20"/>
                 <w:lang w:val="es-ES_tradnl"/>
@@ -228,71 +234,7 @@
             <w:r>
               <w:rPr>
                 <w:b/>
-                <w:color w:themeColor="background1" w:val="FFFFFF"/>
-                <w:kern w:val="0"/>
-                <w:sz w:val="20"/>
-                <w:szCs w:val="20"/>
-                <w:lang w:val="es-ES_tradnl" w:eastAsia="en-US" w:bidi="ar-SA"/>
-              </w:rPr>
-              <w:t>Fuente</w:t>
-            </w:r>
-          </w:p>
-        </w:tc>
-        <w:tc>
-          <w:tcPr>
-            <w:tcW w:w="6842" w:type="dxa"/>
-            <w:tcBorders/>
-          </w:tcPr>
-          <w:p>
-            <w:pPr>
-              <w:pStyle w:val="Normal"/>
-              <w:widowControl/>
-              <w:spacing w:lineRule="auto" w:line="240" w:before="0" w:after="0"/>
-              <w:jc w:val="start"/>
-              <w:rPr>
-                <w:sz w:val="20"/>
-                <w:szCs w:val="20"/>
-                <w:lang w:val="es-ES_tradnl"/>
-              </w:rPr>
-            </w:pPr>
-            <w:r>
-              <w:rPr>
-                <w:kern w:val="0"/>
-                <w:sz w:val="20"/>
-                <w:szCs w:val="20"/>
-                <w:lang w:val="es-ES_tradnl" w:eastAsia="en-US" w:bidi="ar-SA"/>
-              </w:rPr>
-              <w:t>Nombre e identificador de la fuente o fuentes utilizadas para la captura de la historia de usuario.</w:t>
-            </w:r>
-          </w:p>
-        </w:tc>
-      </w:tr>
-      <w:tr>
-        <w:trPr/>
-        <w:tc>
-          <w:tcPr>
-            <w:tcW w:w="1652" w:type="dxa"/>
-            <w:tcBorders/>
-            <w:shd w:color="auto" w:fill="948A54" w:themeFill="background2" w:themeFillShade="80" w:val="clear"/>
-          </w:tcPr>
-          <w:p>
-            <w:pPr>
-              <w:pStyle w:val="Normal"/>
-              <w:widowControl/>
-              <w:spacing w:lineRule="auto" w:line="240" w:before="0" w:after="0"/>
-              <w:jc w:val="start"/>
-              <w:rPr>
-                <w:b/>
-                <w:color w:themeColor="background1" w:val="FFFFFF"/>
-                <w:sz w:val="20"/>
-                <w:szCs w:val="20"/>
-                <w:lang w:val="es-ES_tradnl"/>
-              </w:rPr>
-            </w:pPr>
-            <w:r>
-              <w:rPr>
-                <w:b/>
-                <w:color w:themeColor="background1" w:val="FFFFFF"/>
+                <w:color w:val="FFFFFF" w:themeColor="background1"/>
                 <w:kern w:val="0"/>
                 <w:sz w:val="20"/>
                 <w:szCs w:val="20"/>
@@ -304,15 +246,16 @@
         </w:tc>
         <w:tc>
           <w:tcPr>
-            <w:tcW w:w="6842" w:type="dxa"/>
+            <w:tcW w:w="6841" w:type="dxa"/>
             <w:tcBorders/>
           </w:tcPr>
           <w:p>
             <w:pPr>
               <w:pStyle w:val="Normal"/>
-              <w:widowControl/>
+              <w:widowControl w:val="false"/>
+              <w:suppressAutoHyphens w:val="true"/>
               <w:spacing w:lineRule="auto" w:line="240" w:before="0" w:after="0"/>
-              <w:jc w:val="start"/>
+              <w:jc w:val="left"/>
               <w:rPr>
                 <w:sz w:val="20"/>
                 <w:szCs w:val="20"/>
@@ -342,12 +285,14 @@
           <w:p>
             <w:pPr>
               <w:pStyle w:val="Normal"/>
-              <w:widowControl/>
+              <w:widowControl w:val="false"/>
+              <w:suppressAutoHyphens w:val="true"/>
               <w:spacing w:lineRule="auto" w:line="240" w:before="0" w:after="0"/>
-              <w:jc w:val="start"/>
+              <w:jc w:val="left"/>
               <w:rPr>
                 <w:b/>
-                <w:color w:themeColor="background1" w:val="FFFFFF"/>
+                <w:b/>
+                <w:color w:val="FFFFFF" w:themeColor="background1"/>
                 <w:sz w:val="20"/>
                 <w:szCs w:val="20"/>
                 <w:lang w:val="es-ES_tradnl"/>
@@ -356,7 +301,7 @@
             <w:r>
               <w:rPr>
                 <w:b/>
-                <w:color w:themeColor="background1" w:val="FFFFFF"/>
+                <w:color w:val="FFFFFF" w:themeColor="background1"/>
                 <w:kern w:val="0"/>
                 <w:sz w:val="20"/>
                 <w:szCs w:val="20"/>
@@ -368,15 +313,16 @@
         </w:tc>
         <w:tc>
           <w:tcPr>
-            <w:tcW w:w="6842" w:type="dxa"/>
+            <w:tcW w:w="6841" w:type="dxa"/>
             <w:tcBorders/>
           </w:tcPr>
           <w:p>
             <w:pPr>
               <w:pStyle w:val="Normal"/>
-              <w:widowControl/>
+              <w:widowControl w:val="false"/>
+              <w:suppressAutoHyphens w:val="true"/>
               <w:spacing w:lineRule="auto" w:line="240" w:before="0" w:after="0"/>
-              <w:jc w:val="start"/>
+              <w:jc w:val="left"/>
               <w:rPr>
                 <w:sz w:val="20"/>
                 <w:szCs w:val="20"/>
@@ -406,12 +352,14 @@
           <w:p>
             <w:pPr>
               <w:pStyle w:val="Normal"/>
-              <w:widowControl/>
+              <w:widowControl w:val="false"/>
+              <w:suppressAutoHyphens w:val="true"/>
               <w:spacing w:lineRule="auto" w:line="240" w:before="0" w:after="0"/>
-              <w:jc w:val="start"/>
+              <w:jc w:val="left"/>
               <w:rPr>
                 <w:b/>
-                <w:color w:themeColor="background1" w:val="FFFFFF"/>
+                <w:b/>
+                <w:color w:val="FFFFFF" w:themeColor="background1"/>
                 <w:sz w:val="20"/>
                 <w:szCs w:val="20"/>
                 <w:lang w:val="es-ES_tradnl"/>
@@ -420,7 +368,7 @@
             <w:r>
               <w:rPr>
                 <w:b/>
-                <w:color w:themeColor="background1" w:val="FFFFFF"/>
+                <w:color w:val="FFFFFF" w:themeColor="background1"/>
                 <w:kern w:val="0"/>
                 <w:sz w:val="20"/>
                 <w:szCs w:val="20"/>
@@ -432,15 +380,16 @@
         </w:tc>
         <w:tc>
           <w:tcPr>
-            <w:tcW w:w="6842" w:type="dxa"/>
+            <w:tcW w:w="6841" w:type="dxa"/>
             <w:tcBorders/>
           </w:tcPr>
           <w:p>
             <w:pPr>
               <w:pStyle w:val="Normal"/>
-              <w:widowControl/>
+              <w:widowControl w:val="false"/>
+              <w:suppressAutoHyphens w:val="true"/>
               <w:spacing w:lineRule="auto" w:line="240" w:before="0" w:after="0"/>
-              <w:jc w:val="start"/>
+              <w:jc w:val="left"/>
               <w:rPr>
                 <w:sz w:val="20"/>
                 <w:szCs w:val="20"/>
@@ -465,7 +414,7 @@
         <w:pStyle w:val="Heading2"/>
         <w:numPr>
           <w:ilvl w:val="0"/>
-          <w:numId w:val="1"/>
+          <w:numId w:val="2"/>
         </w:numPr>
         <w:rPr>
           <w:lang w:val="es-ES_tradnl"/>
@@ -537,10 +486,11 @@
       <w:pPr>
         <w:pStyle w:val="ListParagraph"/>
         <w:spacing w:lineRule="auto" w:line="240" w:before="0" w:after="0"/>
-        <w:ind w:start="0"/>
+        <w:ind w:left="0" w:hanging="0"/>
         <w:contextualSpacing/>
-        <w:jc w:val="end"/>
+        <w:jc w:val="right"/>
         <w:rPr>
+          <w:i/>
           <w:i/>
           <w:lang w:val="es-ES_tradnl"/>
         </w:rPr>
@@ -573,7 +523,7 @@
 </file>
 
 <file path=word/footer1.xml><?xml version="1.0" encoding="utf-8"?>
-<w:ftr xmlns:o="urn:schemas-microsoft-com:office:office" xmlns:r="http://schemas.openxmlformats.org/officeDocument/2006/relationships" xmlns:v="urn:schemas-microsoft-com:vml" xmlns:w="http://schemas.openxmlformats.org/wordprocessingml/2006/main" xmlns:w10="urn:schemas-microsoft-com:office:word" xmlns:wp="http://schemas.openxmlformats.org/drawingml/2006/wordprocessingDrawing" xmlns:pic="http://schemas.openxmlformats.org/drawingml/2006/picture" xmlns:wps="http://schemas.microsoft.com/office/word/2010/wordprocessingShape" xmlns:wpg="http://schemas.microsoft.com/office/word/2010/wordprocessingGroup" xmlns:mc="http://schemas.openxmlformats.org/markup-compatibility/2006" xmlns:wp14="http://schemas.microsoft.com/office/word/2010/wordprocessingDrawing" xmlns:w14="http://schemas.microsoft.com/office/word/2010/wordml" xmlns:w15="http://schemas.microsoft.com/office/word/2012/wordml" mc:Ignorable="w14 wp14 w15">
+<w:ftr xmlns:o="urn:schemas-microsoft-com:office:office" xmlns:r="http://schemas.openxmlformats.org/officeDocument/2006/relationships" xmlns:v="urn:schemas-microsoft-com:vml" xmlns:w="http://schemas.openxmlformats.org/wordprocessingml/2006/main" xmlns:w10="urn:schemas-microsoft-com:office:word" xmlns:wp="http://schemas.openxmlformats.org/drawingml/2006/wordprocessingDrawing" xmlns:wps="http://schemas.microsoft.com/office/word/2010/wordprocessingShape" xmlns:wpg="http://schemas.microsoft.com/office/word/2010/wordprocessingGroup" xmlns:mc="http://schemas.openxmlformats.org/markup-compatibility/2006" xmlns:wp14="http://schemas.microsoft.com/office/word/2010/wordprocessingDrawing" xmlns:w14="http://schemas.microsoft.com/office/word/2010/wordml" xmlns:w15="http://schemas.microsoft.com/office/word/2012/wordml" mc:Ignorable="w14 wp14 w15">
   <w:sdt>
     <w:sdtPr>
       <w:docPartObj>
@@ -585,7 +535,7 @@
       <w:p>
         <w:pPr>
           <w:pStyle w:val="Footer"/>
-          <w:ind w:start="720"/>
+          <w:ind w:left="720" w:hanging="0"/>
           <w:jc w:val="center"/>
           <w:rPr/>
         </w:pPr>
@@ -633,7 +583,7 @@
 </file>
 
 <file path=word/footer2.xml><?xml version="1.0" encoding="utf-8"?>
-<w:ftr xmlns:o="urn:schemas-microsoft-com:office:office" xmlns:r="http://schemas.openxmlformats.org/officeDocument/2006/relationships" xmlns:v="urn:schemas-microsoft-com:vml" xmlns:w="http://schemas.openxmlformats.org/wordprocessingml/2006/main" xmlns:w10="urn:schemas-microsoft-com:office:word" xmlns:wp="http://schemas.openxmlformats.org/drawingml/2006/wordprocessingDrawing" xmlns:pic="http://schemas.openxmlformats.org/drawingml/2006/picture" xmlns:wps="http://schemas.microsoft.com/office/word/2010/wordprocessingShape" xmlns:wpg="http://schemas.microsoft.com/office/word/2010/wordprocessingGroup" xmlns:mc="http://schemas.openxmlformats.org/markup-compatibility/2006" xmlns:wp14="http://schemas.microsoft.com/office/word/2010/wordprocessingDrawing" xmlns:w14="http://schemas.microsoft.com/office/word/2010/wordml" xmlns:w15="http://schemas.microsoft.com/office/word/2012/wordml" mc:Ignorable="w14 wp14 w15">
+<w:ftr xmlns:o="urn:schemas-microsoft-com:office:office" xmlns:r="http://schemas.openxmlformats.org/officeDocument/2006/relationships" xmlns:v="urn:schemas-microsoft-com:vml" xmlns:w="http://schemas.openxmlformats.org/wordprocessingml/2006/main" xmlns:w10="urn:schemas-microsoft-com:office:word" xmlns:wp="http://schemas.openxmlformats.org/drawingml/2006/wordprocessingDrawing" xmlns:wps="http://schemas.microsoft.com/office/word/2010/wordprocessingShape" xmlns:wpg="http://schemas.microsoft.com/office/word/2010/wordprocessingGroup" xmlns:mc="http://schemas.openxmlformats.org/markup-compatibility/2006" xmlns:wp14="http://schemas.microsoft.com/office/word/2010/wordprocessingDrawing" xmlns:w14="http://schemas.microsoft.com/office/word/2010/wordml" xmlns:w15="http://schemas.microsoft.com/office/word/2012/wordml" mc:Ignorable="w14 wp14 w15">
   <w:sdt>
     <w:sdtPr>
       <w:docPartObj>
@@ -692,7 +642,7 @@
 </file>
 
 <file path=word/footer3.xml><?xml version="1.0" encoding="utf-8"?>
-<w:ftr xmlns:o="urn:schemas-microsoft-com:office:office" xmlns:r="http://schemas.openxmlformats.org/officeDocument/2006/relationships" xmlns:v="urn:schemas-microsoft-com:vml" xmlns:w="http://schemas.openxmlformats.org/wordprocessingml/2006/main" xmlns:w10="urn:schemas-microsoft-com:office:word" xmlns:wp="http://schemas.openxmlformats.org/drawingml/2006/wordprocessingDrawing" xmlns:pic="http://schemas.openxmlformats.org/drawingml/2006/picture" xmlns:wps="http://schemas.microsoft.com/office/word/2010/wordprocessingShape" xmlns:wpg="http://schemas.microsoft.com/office/word/2010/wordprocessingGroup" xmlns:mc="http://schemas.openxmlformats.org/markup-compatibility/2006" xmlns:wp14="http://schemas.microsoft.com/office/word/2010/wordprocessingDrawing" xmlns:w14="http://schemas.microsoft.com/office/word/2010/wordml" xmlns:w15="http://schemas.microsoft.com/office/word/2012/wordml" mc:Ignorable="w14 wp14 w15">
+<w:ftr xmlns:o="urn:schemas-microsoft-com:office:office" xmlns:r="http://schemas.openxmlformats.org/officeDocument/2006/relationships" xmlns:v="urn:schemas-microsoft-com:vml" xmlns:w="http://schemas.openxmlformats.org/wordprocessingml/2006/main" xmlns:w10="urn:schemas-microsoft-com:office:word" xmlns:wp="http://schemas.openxmlformats.org/drawingml/2006/wordprocessingDrawing" xmlns:wps="http://schemas.microsoft.com/office/word/2010/wordprocessingShape" xmlns:wpg="http://schemas.microsoft.com/office/word/2010/wordprocessingGroup" xmlns:mc="http://schemas.openxmlformats.org/markup-compatibility/2006" xmlns:wp14="http://schemas.microsoft.com/office/word/2010/wordprocessingDrawing" xmlns:w14="http://schemas.microsoft.com/office/word/2010/wordml" xmlns:w15="http://schemas.microsoft.com/office/word/2012/wordml" mc:Ignorable="w14 wp14 w15">
   <w:sdt>
     <w:sdtPr>
       <w:docPartObj>
@@ -751,7 +701,7 @@
 </file>
 
 <file path=word/header1.xml><?xml version="1.0" encoding="utf-8"?>
-<w:hdr xmlns:o="urn:schemas-microsoft-com:office:office" xmlns:r="http://schemas.openxmlformats.org/officeDocument/2006/relationships" xmlns:v="urn:schemas-microsoft-com:vml" xmlns:w="http://schemas.openxmlformats.org/wordprocessingml/2006/main" xmlns:w10="urn:schemas-microsoft-com:office:word" xmlns:wp="http://schemas.openxmlformats.org/drawingml/2006/wordprocessingDrawing" xmlns:pic="http://schemas.openxmlformats.org/drawingml/2006/picture" xmlns:wps="http://schemas.microsoft.com/office/word/2010/wordprocessingShape" xmlns:wpg="http://schemas.microsoft.com/office/word/2010/wordprocessingGroup" xmlns:mc="http://schemas.openxmlformats.org/markup-compatibility/2006" xmlns:wp14="http://schemas.microsoft.com/office/word/2010/wordprocessingDrawing" xmlns:w14="http://schemas.microsoft.com/office/word/2010/wordml" xmlns:w15="http://schemas.microsoft.com/office/word/2012/wordml" mc:Ignorable="w14 wp14 w15">
+<w:hdr xmlns:o="urn:schemas-microsoft-com:office:office" xmlns:r="http://schemas.openxmlformats.org/officeDocument/2006/relationships" xmlns:v="urn:schemas-microsoft-com:vml" xmlns:w="http://schemas.openxmlformats.org/wordprocessingml/2006/main" xmlns:w10="urn:schemas-microsoft-com:office:word" xmlns:wp="http://schemas.openxmlformats.org/drawingml/2006/wordprocessingDrawing" xmlns:wps="http://schemas.microsoft.com/office/word/2010/wordprocessingShape" xmlns:wpg="http://schemas.microsoft.com/office/word/2010/wordprocessingGroup" xmlns:mc="http://schemas.openxmlformats.org/markup-compatibility/2006" xmlns:wp14="http://schemas.microsoft.com/office/word/2010/wordprocessingDrawing" xmlns:w14="http://schemas.microsoft.com/office/word/2010/wordml" xmlns:w15="http://schemas.microsoft.com/office/word/2012/wordml" mc:Ignorable="w14 wp14 w15">
   <w:p>
     <w:pPr>
       <w:pStyle w:val="Header"/>
@@ -769,26 +719,26 @@
 </file>
 
 <file path=word/header2.xml><?xml version="1.0" encoding="utf-8"?>
-<w:hdr xmlns:o="urn:schemas-microsoft-com:office:office" xmlns:r="http://schemas.openxmlformats.org/officeDocument/2006/relationships" xmlns:v="urn:schemas-microsoft-com:vml" xmlns:w="http://schemas.openxmlformats.org/wordprocessingml/2006/main" xmlns:w10="urn:schemas-microsoft-com:office:word" xmlns:wp="http://schemas.openxmlformats.org/drawingml/2006/wordprocessingDrawing" xmlns:pic="http://schemas.openxmlformats.org/drawingml/2006/picture" xmlns:wps="http://schemas.microsoft.com/office/word/2010/wordprocessingShape" xmlns:wpg="http://schemas.microsoft.com/office/word/2010/wordprocessingGroup" xmlns:mc="http://schemas.openxmlformats.org/markup-compatibility/2006" xmlns:wp14="http://schemas.microsoft.com/office/word/2010/wordprocessingDrawing" xmlns:w14="http://schemas.microsoft.com/office/word/2010/wordml" xmlns:w15="http://schemas.microsoft.com/office/word/2012/wordml" mc:Ignorable="w14 wp14 w15">
+<w:hdr xmlns:o="urn:schemas-microsoft-com:office:office" xmlns:r="http://schemas.openxmlformats.org/officeDocument/2006/relationships" xmlns:v="urn:schemas-microsoft-com:vml" xmlns:w="http://schemas.openxmlformats.org/wordprocessingml/2006/main" xmlns:w10="urn:schemas-microsoft-com:office:word" xmlns:wp="http://schemas.openxmlformats.org/drawingml/2006/wordprocessingDrawing" xmlns:wps="http://schemas.microsoft.com/office/word/2010/wordprocessingShape" xmlns:wpg="http://schemas.microsoft.com/office/word/2010/wordprocessingGroup" xmlns:mc="http://schemas.openxmlformats.org/markup-compatibility/2006" xmlns:wp14="http://schemas.microsoft.com/office/word/2010/wordprocessingDrawing" xmlns:w14="http://schemas.microsoft.com/office/word/2010/wordml" xmlns:w15="http://schemas.microsoft.com/office/word/2012/wordml" mc:Ignorable="w14 wp14 w15">
   <w:tbl>
     <w:tblPr>
       <w:tblW w:w="8505" w:type="dxa"/>
-      <w:jc w:val="start"/>
+      <w:jc w:val="left"/>
       <w:tblInd w:w="0" w:type="dxa"/>
       <w:tblLayout w:type="fixed"/>
       <w:tblCellMar>
         <w:top w:w="0" w:type="dxa"/>
-        <w:start w:w="108" w:type="dxa"/>
+        <w:left w:w="108" w:type="dxa"/>
         <w:bottom w:w="0" w:type="dxa"/>
-        <w:end w:w="108" w:type="dxa"/>
+        <w:right w:w="108" w:type="dxa"/>
       </w:tblCellMar>
       <w:tblLook w:val="00a0" w:noHBand="0" w:noVBand="0" w:firstColumn="1" w:lastRow="0" w:lastColumn="0" w:firstRow="1"/>
     </w:tblPr>
     <w:tblGrid>
-      <w:gridCol w:w="882"/>
-      <w:gridCol w:w="3092"/>
+      <w:gridCol w:w="881"/>
+      <w:gridCol w:w="3093"/>
       <w:gridCol w:w="3415"/>
-      <w:gridCol w:w="1116"/>
+      <w:gridCol w:w="1115"/>
     </w:tblGrid>
     <w:tr>
       <w:trPr>
@@ -796,13 +746,14 @@
       </w:trPr>
       <w:tc>
         <w:tcPr>
-          <w:tcW w:w="882" w:type="dxa"/>
+          <w:tcW w:w="881" w:type="dxa"/>
           <w:tcBorders/>
           <w:vAlign w:val="center"/>
         </w:tcPr>
         <w:p>
           <w:pPr>
             <w:pStyle w:val="Normal"/>
+            <w:widowControl w:val="false"/>
             <w:spacing w:lineRule="auto" w:line="240" w:before="0" w:after="0"/>
             <w:rPr/>
           </w:pPr>
@@ -839,7 +790,6 @@
                         <a:prstGeom prst="rect">
                           <a:avLst/>
                         </a:prstGeom>
-                        <a:noFill/>
                       </pic:spPr>
                     </pic:pic>
                   </a:graphicData>
@@ -851,15 +801,16 @@
       </w:tc>
       <w:tc>
         <w:tcPr>
-          <w:tcW w:w="3092" w:type="dxa"/>
+          <w:tcW w:w="3093" w:type="dxa"/>
           <w:tcBorders/>
           <w:vAlign w:val="center"/>
         </w:tcPr>
         <w:p>
           <w:pPr>
             <w:pStyle w:val="Normal"/>
+            <w:widowControl w:val="false"/>
             <w:spacing w:lineRule="auto" w:line="240" w:before="0" w:after="0"/>
-            <w:jc w:val="end"/>
+            <w:jc w:val="right"/>
             <w:rPr/>
           </w:pPr>
           <w:r>
@@ -870,8 +821,9 @@
         <w:p>
           <w:pPr>
             <w:pStyle w:val="Normal"/>
+            <w:widowControl w:val="false"/>
             <w:spacing w:lineRule="auto" w:line="240" w:before="0" w:after="0"/>
-            <w:jc w:val="end"/>
+            <w:jc w:val="right"/>
             <w:rPr/>
           </w:pPr>
           <w:r>
@@ -882,8 +834,9 @@
         <w:p>
           <w:pPr>
             <w:pStyle w:val="Normal"/>
+            <w:widowControl w:val="false"/>
             <w:spacing w:lineRule="auto" w:line="240" w:before="0" w:after="0"/>
-            <w:jc w:val="end"/>
+            <w:jc w:val="right"/>
             <w:rPr/>
           </w:pPr>
           <w:r>
@@ -901,6 +854,7 @@
         <w:p>
           <w:pPr>
             <w:pStyle w:val="Normal"/>
+            <w:widowControl w:val="false"/>
             <w:spacing w:lineRule="auto" w:line="240" w:before="0" w:after="0"/>
             <w:rPr/>
           </w:pPr>
@@ -912,6 +866,7 @@
         <w:p>
           <w:pPr>
             <w:pStyle w:val="Normal"/>
+            <w:widowControl w:val="false"/>
             <w:spacing w:lineRule="auto" w:line="240" w:before="0" w:after="0"/>
             <w:rPr/>
           </w:pPr>
@@ -923,6 +878,7 @@
         <w:p>
           <w:pPr>
             <w:pStyle w:val="Normal"/>
+            <w:widowControl w:val="false"/>
             <w:spacing w:lineRule="auto" w:line="240" w:before="0" w:after="0"/>
             <w:rPr/>
           </w:pPr>
@@ -934,15 +890,16 @@
       </w:tc>
       <w:tc>
         <w:tcPr>
-          <w:tcW w:w="1116" w:type="dxa"/>
+          <w:tcW w:w="1115" w:type="dxa"/>
           <w:tcBorders/>
           <w:vAlign w:val="center"/>
         </w:tcPr>
         <w:p>
           <w:pPr>
             <w:pStyle w:val="Normal"/>
+            <w:widowControl w:val="false"/>
             <w:spacing w:lineRule="auto" w:line="240" w:before="0" w:after="0"/>
-            <w:jc w:val="end"/>
+            <w:jc w:val="right"/>
             <w:rPr/>
           </w:pPr>
           <w:r>
@@ -978,7 +935,6 @@
                         <a:prstGeom prst="rect">
                           <a:avLst/>
                         </a:prstGeom>
-                        <a:noFill/>
                       </pic:spPr>
                     </pic:pic>
                   </a:graphicData>
@@ -1003,26 +959,26 @@
 </file>
 
 <file path=word/header3.xml><?xml version="1.0" encoding="utf-8"?>
-<w:hdr xmlns:o="urn:schemas-microsoft-com:office:office" xmlns:r="http://schemas.openxmlformats.org/officeDocument/2006/relationships" xmlns:v="urn:schemas-microsoft-com:vml" xmlns:w="http://schemas.openxmlformats.org/wordprocessingml/2006/main" xmlns:w10="urn:schemas-microsoft-com:office:word" xmlns:wp="http://schemas.openxmlformats.org/drawingml/2006/wordprocessingDrawing" xmlns:pic="http://schemas.openxmlformats.org/drawingml/2006/picture" xmlns:wps="http://schemas.microsoft.com/office/word/2010/wordprocessingShape" xmlns:wpg="http://schemas.microsoft.com/office/word/2010/wordprocessingGroup" xmlns:mc="http://schemas.openxmlformats.org/markup-compatibility/2006" xmlns:wp14="http://schemas.microsoft.com/office/word/2010/wordprocessingDrawing" xmlns:w14="http://schemas.microsoft.com/office/word/2010/wordml" xmlns:w15="http://schemas.microsoft.com/office/word/2012/wordml" mc:Ignorable="w14 wp14 w15">
+<w:hdr xmlns:o="urn:schemas-microsoft-com:office:office" xmlns:r="http://schemas.openxmlformats.org/officeDocument/2006/relationships" xmlns:v="urn:schemas-microsoft-com:vml" xmlns:w="http://schemas.openxmlformats.org/wordprocessingml/2006/main" xmlns:w10="urn:schemas-microsoft-com:office:word" xmlns:wp="http://schemas.openxmlformats.org/drawingml/2006/wordprocessingDrawing" xmlns:wps="http://schemas.microsoft.com/office/word/2010/wordprocessingShape" xmlns:wpg="http://schemas.microsoft.com/office/word/2010/wordprocessingGroup" xmlns:mc="http://schemas.openxmlformats.org/markup-compatibility/2006" xmlns:wp14="http://schemas.microsoft.com/office/word/2010/wordprocessingDrawing" xmlns:w14="http://schemas.microsoft.com/office/word/2010/wordml" xmlns:w15="http://schemas.microsoft.com/office/word/2012/wordml" mc:Ignorable="w14 wp14 w15">
   <w:tbl>
     <w:tblPr>
       <w:tblW w:w="8505" w:type="dxa"/>
-      <w:jc w:val="start"/>
+      <w:jc w:val="left"/>
       <w:tblInd w:w="0" w:type="dxa"/>
       <w:tblLayout w:type="fixed"/>
       <w:tblCellMar>
         <w:top w:w="0" w:type="dxa"/>
-        <w:start w:w="108" w:type="dxa"/>
+        <w:left w:w="108" w:type="dxa"/>
         <w:bottom w:w="0" w:type="dxa"/>
-        <w:end w:w="108" w:type="dxa"/>
+        <w:right w:w="108" w:type="dxa"/>
       </w:tblCellMar>
       <w:tblLook w:val="00a0" w:noHBand="0" w:noVBand="0" w:firstColumn="1" w:lastRow="0" w:lastColumn="0" w:firstRow="1"/>
     </w:tblPr>
     <w:tblGrid>
-      <w:gridCol w:w="882"/>
-      <w:gridCol w:w="3092"/>
+      <w:gridCol w:w="881"/>
+      <w:gridCol w:w="3093"/>
       <w:gridCol w:w="3415"/>
-      <w:gridCol w:w="1116"/>
+      <w:gridCol w:w="1115"/>
     </w:tblGrid>
     <w:tr>
       <w:trPr>
@@ -1030,13 +986,14 @@
       </w:trPr>
       <w:tc>
         <w:tcPr>
-          <w:tcW w:w="882" w:type="dxa"/>
+          <w:tcW w:w="881" w:type="dxa"/>
           <w:tcBorders/>
           <w:vAlign w:val="center"/>
         </w:tcPr>
         <w:p>
           <w:pPr>
             <w:pStyle w:val="Normal"/>
+            <w:widowControl w:val="false"/>
             <w:spacing w:lineRule="auto" w:line="240" w:before="0" w:after="0"/>
             <w:rPr/>
           </w:pPr>
@@ -1073,7 +1030,6 @@
                         <a:prstGeom prst="rect">
                           <a:avLst/>
                         </a:prstGeom>
-                        <a:noFill/>
                       </pic:spPr>
                     </pic:pic>
                   </a:graphicData>
@@ -1085,15 +1041,16 @@
       </w:tc>
       <w:tc>
         <w:tcPr>
-          <w:tcW w:w="3092" w:type="dxa"/>
+          <w:tcW w:w="3093" w:type="dxa"/>
           <w:tcBorders/>
           <w:vAlign w:val="center"/>
         </w:tcPr>
         <w:p>
           <w:pPr>
             <w:pStyle w:val="Normal"/>
+            <w:widowControl w:val="false"/>
             <w:spacing w:lineRule="auto" w:line="240" w:before="0" w:after="0"/>
-            <w:jc w:val="end"/>
+            <w:jc w:val="right"/>
             <w:rPr/>
           </w:pPr>
           <w:r>
@@ -1104,8 +1061,9 @@
         <w:p>
           <w:pPr>
             <w:pStyle w:val="Normal"/>
+            <w:widowControl w:val="false"/>
             <w:spacing w:lineRule="auto" w:line="240" w:before="0" w:after="0"/>
-            <w:jc w:val="end"/>
+            <w:jc w:val="right"/>
             <w:rPr/>
           </w:pPr>
           <w:r>
@@ -1116,8 +1074,9 @@
         <w:p>
           <w:pPr>
             <w:pStyle w:val="Normal"/>
+            <w:widowControl w:val="false"/>
             <w:spacing w:lineRule="auto" w:line="240" w:before="0" w:after="0"/>
-            <w:jc w:val="end"/>
+            <w:jc w:val="right"/>
             <w:rPr/>
           </w:pPr>
           <w:r>
@@ -1135,6 +1094,7 @@
         <w:p>
           <w:pPr>
             <w:pStyle w:val="Normal"/>
+            <w:widowControl w:val="false"/>
             <w:spacing w:lineRule="auto" w:line="240" w:before="0" w:after="0"/>
             <w:rPr/>
           </w:pPr>
@@ -1146,6 +1106,7 @@
         <w:p>
           <w:pPr>
             <w:pStyle w:val="Normal"/>
+            <w:widowControl w:val="false"/>
             <w:spacing w:lineRule="auto" w:line="240" w:before="0" w:after="0"/>
             <w:rPr/>
           </w:pPr>
@@ -1157,6 +1118,7 @@
         <w:p>
           <w:pPr>
             <w:pStyle w:val="Normal"/>
+            <w:widowControl w:val="false"/>
             <w:spacing w:lineRule="auto" w:line="240" w:before="0" w:after="0"/>
             <w:rPr/>
           </w:pPr>
@@ -1168,15 +1130,16 @@
       </w:tc>
       <w:tc>
         <w:tcPr>
-          <w:tcW w:w="1116" w:type="dxa"/>
+          <w:tcW w:w="1115" w:type="dxa"/>
           <w:tcBorders/>
           <w:vAlign w:val="center"/>
         </w:tcPr>
         <w:p>
           <w:pPr>
             <w:pStyle w:val="Normal"/>
+            <w:widowControl w:val="false"/>
             <w:spacing w:lineRule="auto" w:line="240" w:before="0" w:after="0"/>
-            <w:jc w:val="end"/>
+            <w:jc w:val="right"/>
             <w:rPr/>
           </w:pPr>
           <w:r>
@@ -1212,7 +1175,6 @@
                         <a:prstGeom prst="rect">
                           <a:avLst/>
                         </a:prstGeom>
-                        <a:noFill/>
                       </pic:spPr>
                     </pic:pic>
                   </a:graphicData>
@@ -1241,142 +1203,15 @@
   <w:abstractNum w:abstractNumId="1">
     <w:lvl w:ilvl="0">
       <w:start w:val="1"/>
-      <w:numFmt w:val="decimal"/>
-      <w:lvlText w:val="%1."/>
-      <w:lvlJc w:val="start"/>
+      <w:numFmt w:val="none"/>
+      <w:suff w:val="nothing"/>
+      <w:lvlText w:val=""/>
+      <w:lvlJc w:val="left"/>
       <w:pPr>
         <w:tabs>
           <w:tab w:val="num" w:pos="0"/>
         </w:tabs>
-        <w:ind w:start="360" w:hanging="360"/>
-      </w:pPr>
-      <w:rPr/>
-    </w:lvl>
-    <w:lvl w:ilvl="1">
-      <w:start w:val="1"/>
-      <w:numFmt w:val="decimal"/>
-      <w:isLgl/>
-      <w:lvlText w:val="%1.%2"/>
-      <w:lvlJc w:val="start"/>
-      <w:pPr>
-        <w:tabs>
-          <w:tab w:val="num" w:pos="0"/>
-        </w:tabs>
-        <w:ind w:start="405" w:hanging="405"/>
-      </w:pPr>
-      <w:rPr/>
-    </w:lvl>
-    <w:lvl w:ilvl="2">
-      <w:start w:val="1"/>
-      <w:numFmt w:val="decimal"/>
-      <w:isLgl/>
-      <w:lvlText w:val="%1.%2.%3"/>
-      <w:lvlJc w:val="start"/>
-      <w:pPr>
-        <w:tabs>
-          <w:tab w:val="num" w:pos="0"/>
-        </w:tabs>
-        <w:ind w:start="720" w:hanging="720"/>
-      </w:pPr>
-      <w:rPr/>
-    </w:lvl>
-    <w:lvl w:ilvl="3">
-      <w:start w:val="1"/>
-      <w:numFmt w:val="decimal"/>
-      <w:isLgl/>
-      <w:lvlText w:val="%1.%2.%3.%4"/>
-      <w:lvlJc w:val="start"/>
-      <w:pPr>
-        <w:tabs>
-          <w:tab w:val="num" w:pos="0"/>
-        </w:tabs>
-        <w:ind w:start="720" w:hanging="720"/>
-      </w:pPr>
-      <w:rPr/>
-    </w:lvl>
-    <w:lvl w:ilvl="4">
-      <w:start w:val="1"/>
-      <w:numFmt w:val="decimal"/>
-      <w:isLgl/>
-      <w:lvlText w:val="%1.%2.%3.%4.%5"/>
-      <w:lvlJc w:val="start"/>
-      <w:pPr>
-        <w:tabs>
-          <w:tab w:val="num" w:pos="0"/>
-        </w:tabs>
-        <w:ind w:start="1080" w:hanging="1080"/>
-      </w:pPr>
-      <w:rPr/>
-    </w:lvl>
-    <w:lvl w:ilvl="5">
-      <w:start w:val="1"/>
-      <w:numFmt w:val="decimal"/>
-      <w:isLgl/>
-      <w:lvlText w:val="%1.%2.%3.%4.%5.%6"/>
-      <w:lvlJc w:val="start"/>
-      <w:pPr>
-        <w:tabs>
-          <w:tab w:val="num" w:pos="0"/>
-        </w:tabs>
-        <w:ind w:start="1080" w:hanging="1080"/>
-      </w:pPr>
-      <w:rPr/>
-    </w:lvl>
-    <w:lvl w:ilvl="6">
-      <w:start w:val="1"/>
-      <w:numFmt w:val="decimal"/>
-      <w:isLgl/>
-      <w:lvlText w:val="%1.%2.%3.%4.%5.%6.%7"/>
-      <w:lvlJc w:val="start"/>
-      <w:pPr>
-        <w:tabs>
-          <w:tab w:val="num" w:pos="0"/>
-        </w:tabs>
-        <w:ind w:start="1440" w:hanging="1440"/>
-      </w:pPr>
-      <w:rPr/>
-    </w:lvl>
-    <w:lvl w:ilvl="7">
-      <w:start w:val="1"/>
-      <w:numFmt w:val="decimal"/>
-      <w:isLgl/>
-      <w:lvlText w:val="%1.%2.%3.%4.%5.%6.%7.%8"/>
-      <w:lvlJc w:val="start"/>
-      <w:pPr>
-        <w:tabs>
-          <w:tab w:val="num" w:pos="0"/>
-        </w:tabs>
-        <w:ind w:start="1440" w:hanging="1440"/>
-      </w:pPr>
-      <w:rPr/>
-    </w:lvl>
-    <w:lvl w:ilvl="8">
-      <w:start w:val="1"/>
-      <w:numFmt w:val="decimal"/>
-      <w:isLgl/>
-      <w:lvlText w:val="%1.%2.%3.%4.%5.%6.%7.%8.%9"/>
-      <w:lvlJc w:val="start"/>
-      <w:pPr>
-        <w:tabs>
-          <w:tab w:val="num" w:pos="0"/>
-        </w:tabs>
-        <w:ind w:start="1440" w:hanging="1440"/>
-      </w:pPr>
-      <w:rPr/>
-    </w:lvl>
-  </w:abstractNum>
-  <w:abstractNum w:abstractNumId="2">
-    <w:lvl w:ilvl="0">
-      <w:start w:val="1"/>
-      <w:numFmt w:val="none"/>
-      <w:suff w:val="nothing"/>
-      <w:lvlText w:val=""/>
-      <w:lvlJc w:val="start"/>
-      <w:pPr>
-        <w:tabs>
-          <w:tab w:val="num" w:pos="0"/>
-        </w:tabs>
-        <w:ind w:start="0" w:hanging="0"/>
+        <w:ind w:left="0" w:hanging="0"/>
       </w:pPr>
     </w:lvl>
     <w:lvl w:ilvl="1">
@@ -1384,12 +1219,12 @@
       <w:numFmt w:val="none"/>
       <w:suff w:val="nothing"/>
       <w:lvlText w:val=""/>
-      <w:lvlJc w:val="start"/>
+      <w:lvlJc w:val="left"/>
       <w:pPr>
         <w:tabs>
           <w:tab w:val="num" w:pos="0"/>
         </w:tabs>
-        <w:ind w:start="0" w:hanging="0"/>
+        <w:ind w:left="0" w:hanging="0"/>
       </w:pPr>
     </w:lvl>
     <w:lvl w:ilvl="2">
@@ -1397,12 +1232,12 @@
       <w:numFmt w:val="none"/>
       <w:suff w:val="nothing"/>
       <w:lvlText w:val=""/>
-      <w:lvlJc w:val="start"/>
+      <w:lvlJc w:val="left"/>
       <w:pPr>
         <w:tabs>
           <w:tab w:val="num" w:pos="0"/>
         </w:tabs>
-        <w:ind w:start="0" w:hanging="0"/>
+        <w:ind w:left="0" w:hanging="0"/>
       </w:pPr>
     </w:lvl>
     <w:lvl w:ilvl="3">
@@ -1410,12 +1245,12 @@
       <w:numFmt w:val="none"/>
       <w:suff w:val="nothing"/>
       <w:lvlText w:val=""/>
-      <w:lvlJc w:val="start"/>
+      <w:lvlJc w:val="left"/>
       <w:pPr>
         <w:tabs>
           <w:tab w:val="num" w:pos="0"/>
         </w:tabs>
-        <w:ind w:start="0" w:hanging="0"/>
+        <w:ind w:left="0" w:hanging="0"/>
       </w:pPr>
     </w:lvl>
     <w:lvl w:ilvl="4">
@@ -1423,12 +1258,12 @@
       <w:numFmt w:val="none"/>
       <w:suff w:val="nothing"/>
       <w:lvlText w:val=""/>
-      <w:lvlJc w:val="start"/>
+      <w:lvlJc w:val="left"/>
       <w:pPr>
         <w:tabs>
           <w:tab w:val="num" w:pos="0"/>
         </w:tabs>
-        <w:ind w:start="0" w:hanging="0"/>
+        <w:ind w:left="0" w:hanging="0"/>
       </w:pPr>
     </w:lvl>
     <w:lvl w:ilvl="5">
@@ -1436,12 +1271,12 @@
       <w:numFmt w:val="none"/>
       <w:suff w:val="nothing"/>
       <w:lvlText w:val=""/>
-      <w:lvlJc w:val="start"/>
+      <w:lvlJc w:val="left"/>
       <w:pPr>
         <w:tabs>
           <w:tab w:val="num" w:pos="0"/>
         </w:tabs>
-        <w:ind w:start="0" w:hanging="0"/>
+        <w:ind w:left="0" w:hanging="0"/>
       </w:pPr>
     </w:lvl>
     <w:lvl w:ilvl="6">
@@ -1449,12 +1284,12 @@
       <w:numFmt w:val="none"/>
       <w:suff w:val="nothing"/>
       <w:lvlText w:val=""/>
-      <w:lvlJc w:val="start"/>
+      <w:lvlJc w:val="left"/>
       <w:pPr>
         <w:tabs>
           <w:tab w:val="num" w:pos="0"/>
         </w:tabs>
-        <w:ind w:start="0" w:hanging="0"/>
+        <w:ind w:left="0" w:hanging="0"/>
       </w:pPr>
     </w:lvl>
     <w:lvl w:ilvl="7">
@@ -1462,12 +1297,12 @@
       <w:numFmt w:val="none"/>
       <w:suff w:val="nothing"/>
       <w:lvlText w:val=""/>
-      <w:lvlJc w:val="start"/>
+      <w:lvlJc w:val="left"/>
       <w:pPr>
         <w:tabs>
           <w:tab w:val="num" w:pos="0"/>
         </w:tabs>
-        <w:ind w:start="0" w:hanging="0"/>
+        <w:ind w:left="0" w:hanging="0"/>
       </w:pPr>
     </w:lvl>
     <w:lvl w:ilvl="8">
@@ -1475,13 +1310,132 @@
       <w:numFmt w:val="none"/>
       <w:suff w:val="nothing"/>
       <w:lvlText w:val=""/>
-      <w:lvlJc w:val="start"/>
+      <w:lvlJc w:val="left"/>
       <w:pPr>
         <w:tabs>
           <w:tab w:val="num" w:pos="0"/>
         </w:tabs>
-        <w:ind w:start="0" w:hanging="0"/>
-      </w:pPr>
+        <w:ind w:left="0" w:hanging="0"/>
+      </w:pPr>
+    </w:lvl>
+  </w:abstractNum>
+  <w:abstractNum w:abstractNumId="2">
+    <w:lvl w:ilvl="0">
+      <w:start w:val="1"/>
+      <w:numFmt w:val="decimal"/>
+      <w:lvlText w:val="%1."/>
+      <w:lvlJc w:val="left"/>
+      <w:pPr>
+        <w:tabs>
+          <w:tab w:val="num" w:pos="0"/>
+        </w:tabs>
+        <w:ind w:left="360" w:hanging="360"/>
+      </w:pPr>
+      <w:rPr/>
+    </w:lvl>
+    <w:lvl w:ilvl="1">
+      <w:start w:val="1"/>
+      <w:numFmt w:val="decimal"/>
+      <w:lvlText w:val="%1.%2"/>
+      <w:lvlJc w:val="left"/>
+      <w:pPr>
+        <w:tabs>
+          <w:tab w:val="num" w:pos="0"/>
+        </w:tabs>
+        <w:ind w:left="405" w:hanging="405"/>
+      </w:pPr>
+      <w:rPr/>
+    </w:lvl>
+    <w:lvl w:ilvl="2">
+      <w:start w:val="1"/>
+      <w:numFmt w:val="decimal"/>
+      <w:lvlText w:val="%1.%2.%3"/>
+      <w:lvlJc w:val="left"/>
+      <w:pPr>
+        <w:tabs>
+          <w:tab w:val="num" w:pos="0"/>
+        </w:tabs>
+        <w:ind w:left="720" w:hanging="720"/>
+      </w:pPr>
+      <w:rPr/>
+    </w:lvl>
+    <w:lvl w:ilvl="3">
+      <w:start w:val="1"/>
+      <w:numFmt w:val="decimal"/>
+      <w:lvlText w:val="%1.%2.%3.%4"/>
+      <w:lvlJc w:val="left"/>
+      <w:pPr>
+        <w:tabs>
+          <w:tab w:val="num" w:pos="0"/>
+        </w:tabs>
+        <w:ind w:left="720" w:hanging="720"/>
+      </w:pPr>
+      <w:rPr/>
+    </w:lvl>
+    <w:lvl w:ilvl="4">
+      <w:start w:val="1"/>
+      <w:numFmt w:val="decimal"/>
+      <w:lvlText w:val="%1.%2.%3.%4.%5"/>
+      <w:lvlJc w:val="left"/>
+      <w:pPr>
+        <w:tabs>
+          <w:tab w:val="num" w:pos="0"/>
+        </w:tabs>
+        <w:ind w:left="1080" w:hanging="1080"/>
+      </w:pPr>
+      <w:rPr/>
+    </w:lvl>
+    <w:lvl w:ilvl="5">
+      <w:start w:val="1"/>
+      <w:numFmt w:val="decimal"/>
+      <w:lvlText w:val="%1.%2.%3.%4.%5.%6"/>
+      <w:lvlJc w:val="left"/>
+      <w:pPr>
+        <w:tabs>
+          <w:tab w:val="num" w:pos="0"/>
+        </w:tabs>
+        <w:ind w:left="1080" w:hanging="1080"/>
+      </w:pPr>
+      <w:rPr/>
+    </w:lvl>
+    <w:lvl w:ilvl="6">
+      <w:start w:val="1"/>
+      <w:numFmt w:val="decimal"/>
+      <w:lvlText w:val="%1.%2.%3.%4.%5.%6.%7"/>
+      <w:lvlJc w:val="left"/>
+      <w:pPr>
+        <w:tabs>
+          <w:tab w:val="num" w:pos="0"/>
+        </w:tabs>
+        <w:ind w:left="1440" w:hanging="1440"/>
+      </w:pPr>
+      <w:rPr/>
+    </w:lvl>
+    <w:lvl w:ilvl="7">
+      <w:start w:val="1"/>
+      <w:numFmt w:val="decimal"/>
+      <w:lvlText w:val="%1.%2.%3.%4.%5.%6.%7.%8"/>
+      <w:lvlJc w:val="left"/>
+      <w:pPr>
+        <w:tabs>
+          <w:tab w:val="num" w:pos="0"/>
+        </w:tabs>
+        <w:ind w:left="1440" w:hanging="1440"/>
+      </w:pPr>
+      <w:rPr/>
+    </w:lvl>
+    <w:lvl w:ilvl="8">
+      <w:start w:val="1"/>
+      <w:numFmt w:val="decimal"/>
+      <w:lvlText w:val="%1.%2.%3.%4.%5.%6.%7.%8.%9"/>
+      <w:lvlJc w:val="left"/>
+      <w:pPr>
+        <w:tabs>
+          <w:tab w:val="num" w:pos="0"/>
+        </w:tabs>
+        <w:ind w:left="1440" w:hanging="1440"/>
+      </w:pPr>
+      <w:rPr/>
     </w:lvl>
   </w:abstractNum>
   <w:num w:numId="1">
@@ -1894,9 +1848,10 @@
     <w:rsid w:val="008d1574"/>
     <w:pPr>
       <w:widowControl/>
+      <w:suppressAutoHyphens w:val="true"/>
       <w:bidi w:val="0"/>
       <w:spacing w:lineRule="auto" w:line="276" w:before="0" w:after="200"/>
-      <w:jc w:val="start"/>
+      <w:jc w:val="left"/>
     </w:pPr>
     <w:rPr>
       <w:rFonts w:ascii="Calibri" w:hAnsi="Calibri" w:eastAsia="Calibri" w:cs="Times New Roman" w:asciiTheme="minorHAnsi" w:eastAsiaTheme="minorHAnsi" w:hAnsiTheme="minorHAnsi"/>
@@ -1908,7 +1863,7 @@
     </w:rPr>
   </w:style>
   <w:style w:type="paragraph" w:styleId="Heading1">
-    <w:name w:val="heading 1"/>
+    <w:name w:val="Heading 1"/>
     <w:basedOn w:val="Normal"/>
     <w:next w:val="Normal"/>
     <w:link w:val="Ttulo1Car"/>
@@ -1925,13 +1880,13 @@
       <w:rFonts w:ascii="Cambria" w:hAnsi="Cambria" w:eastAsia="" w:cs="" w:asciiTheme="majorHAnsi" w:cstheme="majorBidi" w:eastAsiaTheme="majorEastAsia" w:hAnsiTheme="majorHAnsi"/>
       <w:b/>
       <w:bCs/>
-      <w:color w:themeColor="accent1" w:themeShade="bf" w:val="365F91"/>
+      <w:color w:val="365F91" w:themeColor="accent1" w:themeShade="bf"/>
       <w:sz w:val="28"/>
       <w:szCs w:val="28"/>
     </w:rPr>
   </w:style>
   <w:style w:type="paragraph" w:styleId="Heading2">
-    <w:name w:val="heading 2"/>
+    <w:name w:val="Heading 2"/>
     <w:basedOn w:val="Normal"/>
     <w:next w:val="Normal"/>
     <w:link w:val="Ttulo2Car"/>
@@ -1949,7 +1904,7 @@
       <w:rFonts w:ascii="Cambria" w:hAnsi="Cambria" w:eastAsia="" w:cs="" w:asciiTheme="majorHAnsi" w:cstheme="majorBidi" w:eastAsiaTheme="majorEastAsia" w:hAnsiTheme="majorHAnsi"/>
       <w:b/>
       <w:bCs/>
-      <w:color w:themeColor="accent1" w:val="4F81BD"/>
+      <w:color w:val="4F81BD" w:themeColor="accent1"/>
       <w:sz w:val="26"/>
       <w:szCs w:val="26"/>
     </w:rPr>
@@ -2009,7 +1964,7 @@
       <w:rFonts w:ascii="Cambria" w:hAnsi="Cambria" w:eastAsia="" w:cs="" w:asciiTheme="majorHAnsi" w:cstheme="majorBidi" w:eastAsiaTheme="majorEastAsia" w:hAnsiTheme="majorHAnsi"/>
       <w:b/>
       <w:bCs/>
-      <w:color w:themeColor="accent1" w:themeShade="bf" w:val="365F91"/>
+      <w:color w:val="365F91" w:themeColor="accent1" w:themeShade="bf"/>
       <w:sz w:val="28"/>
       <w:szCs w:val="28"/>
     </w:rPr>
@@ -2025,7 +1980,7 @@
       <w:rFonts w:ascii="Cambria" w:hAnsi="Cambria" w:eastAsia="" w:cs="" w:asciiTheme="majorHAnsi" w:cstheme="majorBidi" w:eastAsiaTheme="majorEastAsia" w:hAnsiTheme="majorHAnsi"/>
       <w:b/>
       <w:bCs/>
-      <w:color w:themeColor="accent1" w:val="4F81BD"/>
+      <w:color w:val="4F81BD" w:themeColor="accent1"/>
       <w:sz w:val="26"/>
       <w:szCs w:val="26"/>
     </w:rPr>
@@ -2033,7 +1988,7 @@
   <w:style w:type="character" w:styleId="TextonotaalfinalCar" w:customStyle="1">
     <w:name w:val="Texto nota al final Car"/>
     <w:basedOn w:val="DefaultParagraphFont"/>
-    <w:link w:val="EndnoteText"/>
+    <w:link w:val="Endnote"/>
     <w:uiPriority w:val="99"/>
     <w:semiHidden/>
     <w:qFormat/>
@@ -2046,7 +2001,6 @@
   </w:style>
   <w:style w:type="character" w:styleId="EndnoteCharacters">
     <w:name w:val="Endnote Characters"/>
-    <w:basedOn w:val="DefaultParagraphFont"/>
     <w:uiPriority w:val="99"/>
     <w:semiHidden/>
     <w:unhideWhenUsed/>
@@ -2056,8 +2010,8 @@
       <w:vertAlign w:val="superscript"/>
     </w:rPr>
   </w:style>
-  <w:style w:type="character" w:styleId="EndnoteReference">
-    <w:name w:val="endnote reference"/>
+  <w:style w:type="character" w:styleId="EndnoteAnchor">
+    <w:name w:val="Endnote Anchor"/>
     <w:rPr>
       <w:vertAlign w:val="superscript"/>
     </w:rPr>
@@ -2065,7 +2019,7 @@
   <w:style w:type="character" w:styleId="TextonotapieCar" w:customStyle="1">
     <w:name w:val="Texto nota pie Car"/>
     <w:basedOn w:val="DefaultParagraphFont"/>
-    <w:link w:val="FootnoteText"/>
+    <w:link w:val="Footnote"/>
     <w:uiPriority w:val="99"/>
     <w:semiHidden/>
     <w:qFormat/>
@@ -2078,7 +2032,6 @@
   </w:style>
   <w:style w:type="character" w:styleId="FootnoteCharacters">
     <w:name w:val="Footnote Characters"/>
-    <w:basedOn w:val="DefaultParagraphFont"/>
     <w:uiPriority w:val="99"/>
     <w:semiHidden/>
     <w:unhideWhenUsed/>
@@ -2088,8 +2041,8 @@
       <w:vertAlign w:val="superscript"/>
     </w:rPr>
   </w:style>
-  <w:style w:type="character" w:styleId="FootnoteReference">
-    <w:name w:val="footnote reference"/>
+  <w:style w:type="character" w:styleId="FootnoteAnchor">
+    <w:name w:val="Footnote Anchor"/>
     <w:rPr>
       <w:vertAlign w:val="superscript"/>
     </w:rPr>
@@ -2097,7 +2050,7 @@
   <w:style w:type="paragraph" w:styleId="Heading">
     <w:name w:val="Heading"/>
     <w:basedOn w:val="Normal"/>
-    <w:next w:val="BodyText"/>
+    <w:next w:val="TextBody"/>
     <w:qFormat/>
     <w:pPr>
       <w:keepNext w:val="true"/>
@@ -2109,7 +2062,7 @@
       <w:szCs w:val="28"/>
     </w:rPr>
   </w:style>
-  <w:style w:type="paragraph" w:styleId="BodyText">
+  <w:style w:type="paragraph" w:styleId="TextBody">
     <w:name w:val="Body Text"/>
     <w:basedOn w:val="Normal"/>
     <w:pPr>
@@ -2119,13 +2072,40 @@
   </w:style>
   <w:style w:type="paragraph" w:styleId="List">
     <w:name w:val="List"/>
-    <w:basedOn w:val="BodyText"/>
+    <w:basedOn w:val="TextBody"/>
     <w:pPr/>
     <w:rPr>
       <w:rFonts w:cs="Noto Sans Devanagari"/>
     </w:rPr>
   </w:style>
   <w:style w:type="paragraph" w:styleId="Caption">
+    <w:name w:val="Caption"/>
+    <w:basedOn w:val="Normal"/>
+    <w:qFormat/>
+    <w:pPr>
+      <w:suppressLineNumbers/>
+      <w:spacing w:before="120" w:after="120"/>
+    </w:pPr>
+    <w:rPr>
+      <w:rFonts w:cs="Noto Sans Devanagari"/>
+      <w:i/>
+      <w:iCs/>
+      <w:sz w:val="24"/>
+      <w:szCs w:val="24"/>
+    </w:rPr>
+  </w:style>
+  <w:style w:type="paragraph" w:styleId="Index">
+    <w:name w:val="Index"/>
+    <w:basedOn w:val="Normal"/>
+    <w:qFormat/>
+    <w:pPr>
+      <w:suppressLineNumbers/>
+    </w:pPr>
+    <w:rPr>
+      <w:rFonts w:cs="Noto Sans Devanagari"/>
+    </w:rPr>
+  </w:style>
+  <w:style w:type="paragraph" w:styleId="Caption1">
     <w:name w:val="caption"/>
     <w:basedOn w:val="Normal"/>
     <w:next w:val="Normal"/>
@@ -2139,20 +2119,9 @@
     <w:rPr>
       <w:b/>
       <w:bCs/>
-      <w:color w:themeColor="accent1" w:val="4F81BD"/>
+      <w:color w:val="4F81BD" w:themeColor="accent1"/>
       <w:sz w:val="18"/>
       <w:szCs w:val="18"/>
-    </w:rPr>
-  </w:style>
-  <w:style w:type="paragraph" w:styleId="Index">
-    <w:name w:val="Index"/>
-    <w:basedOn w:val="Normal"/>
-    <w:qFormat/>
-    <w:pPr>
-      <w:suppressLineNumbers/>
-    </w:pPr>
-    <w:rPr>
-      <w:rFonts w:cs="Noto Sans Devanagari"/>
     </w:rPr>
   </w:style>
   <w:style w:type="paragraph" w:styleId="BalloonText">
@@ -2181,7 +2150,7 @@
     <w:rPr/>
   </w:style>
   <w:style w:type="paragraph" w:styleId="Header">
-    <w:name w:val="header"/>
+    <w:name w:val="Header"/>
     <w:basedOn w:val="Normal"/>
     <w:link w:val="EncabezadoCar"/>
     <w:uiPriority w:val="99"/>
@@ -2198,7 +2167,7 @@
     <w:rPr/>
   </w:style>
   <w:style w:type="paragraph" w:styleId="Footer">
-    <w:name w:val="footer"/>
+    <w:name w:val="Footer"/>
     <w:basedOn w:val="Normal"/>
     <w:link w:val="PiedepginaCar"/>
     <w:uiPriority w:val="99"/>
@@ -2222,13 +2191,13 @@
     <w:rsid w:val="00b3188d"/>
     <w:pPr>
       <w:spacing w:before="0" w:after="200"/>
-      <w:ind w:start="720"/>
+      <w:ind w:left="720" w:hanging="0"/>
       <w:contextualSpacing/>
     </w:pPr>
     <w:rPr/>
   </w:style>
-  <w:style w:type="paragraph" w:styleId="EndnoteText">
-    <w:name w:val="endnote text"/>
+  <w:style w:type="paragraph" w:styleId="Endnote">
+    <w:name w:val="Endnote Text"/>
     <w:basedOn w:val="Normal"/>
     <w:link w:val="TextonotaalfinalCar"/>
     <w:uiPriority w:val="99"/>
@@ -2243,8 +2212,8 @@
       <w:szCs w:val="20"/>
     </w:rPr>
   </w:style>
-  <w:style w:type="paragraph" w:styleId="FootnoteText">
-    <w:name w:val="footnote text"/>
+  <w:style w:type="paragraph" w:styleId="Footnote">
+    <w:name w:val="Footnote Text"/>
     <w:basedOn w:val="Normal"/>
     <w:link w:val="TextonotapieCar"/>
     <w:uiPriority w:val="99"/>

</xml_diff>